<commit_message>
Risk analysis 1.1: AWS Business Associate Addendum accepted (September 22, 2026)
Co-Authored-By: Claude Fable 5.1 <noreply@anthropic.com>
Claude-Session: https://claude.ai/code/session_01MCrTcTwyNPkxe2hPsDC8bD
</commit_message>
<xml_diff>
--- a/packages/web/public/docs/Helixona-Assistant-Risk-Analysis.docx
+++ b/packages/web/public/docs/Helixona-Assistant-Risk-Analysis.docx
@@ -269,7 +269,7 @@
                 <w:sz w:val="18"/>
                 <w:szCs w:val="18"/>
               </w:rPr>
-              <w:t xml:space="preserve">1.0, September 16, 2026</w:t>
+              <w:t xml:space="preserve">1.1, September 22, 2026</w:t>
             </w:r>
           </w:p>
         </w:tc>
@@ -4044,7 +4044,7 @@
                 <w:sz w:val="18"/>
                 <w:szCs w:val="18"/>
               </w:rPr>
-              <w:t xml:space="preserve">AWS Business Associate Addendum available in AWS Artifact; only HIPAA-eligible AWS services are used (Appendix A)</w:t>
+              <w:t xml:space="preserve">AWS Business Associate Addendum accepted in AWS Artifact on September 22, 2026; only HIPAA-eligible AWS services are used (Appendix A)</w:t>
             </w:r>
           </w:p>
         </w:tc>
@@ -4125,7 +4125,7 @@
                 <w:sz w:val="18"/>
                 <w:szCs w:val="18"/>
               </w:rPr>
-              <w:t xml:space="preserve">Low once accepted</w:t>
+              <w:t xml:space="preserve">Low</w:t>
             </w:r>
           </w:p>
         </w:tc>
@@ -4152,7 +4152,7 @@
                 <w:sz w:val="18"/>
                 <w:szCs w:val="18"/>
               </w:rPr>
-              <w:t xml:space="preserve">[Confirm the AWS BAA shows Active in AWS Artifact before real patient data is entered.] Owner: account owner. Due: before go-live.</w:t>
+              <w:t xml:space="preserve">Review the addendum and the eligible-services list yearly. Owner: account owner.</w:t>
             </w:r>
           </w:p>
         </w:tc>
@@ -6231,7 +6231,7 @@
                 <w:sz w:val="18"/>
                 <w:szCs w:val="18"/>
               </w:rPr>
-              <w:t xml:space="preserve">[Account owner]</w:t>
+              <w:t xml:space="preserve">Account owner</w:t>
             </w:r>
           </w:p>
         </w:tc>
@@ -6283,7 +6283,7 @@
                 <w:sz w:val="18"/>
                 <w:szCs w:val="18"/>
               </w:rPr>
-              <w:t xml:space="preserve">[ ]</w:t>
+              <w:t xml:space="preserve">Done, September 22, 2026</w:t>
             </w:r>
           </w:p>
         </w:tc>
@@ -7690,7 +7690,7 @@
                 <w:sz w:val="18"/>
                 <w:szCs w:val="18"/>
               </w:rPr>
-              <w:t xml:space="preserve">[Active / date]</w:t>
+              <w:t xml:space="preserve">Active since September 22, 2026 (accepted by the account owner)</w:t>
             </w:r>
           </w:p>
         </w:tc>
@@ -8063,6 +8063,116 @@
         <w:tc>
           <w:tcPr>
             <w:tcW w:type="dxa" w:w="1760"/>
+            <w:tcMar>
+              <w:top w:type="dxa" w:w="60"/>
+              <w:left w:type="dxa" w:w="100"/>
+              <w:bottom w:type="dxa" w:w="60"/>
+              <w:right w:type="dxa" w:w="100"/>
+            </w:tcMar>
+            <w:vAlign w:val="top"/>
+          </w:tcPr>
+          <w:p>
+            <w:pPr>
+              <w:spacing w:after="40"/>
+            </w:pPr>
+            <w:r>
+              <w:rPr>
+                <w:b w:val="false"/>
+                <w:bCs w:val="false"/>
+                <w:sz w:val="18"/>
+                <w:szCs w:val="18"/>
+              </w:rPr>
+              <w:t xml:space="preserve">[Name]</w:t>
+            </w:r>
+          </w:p>
+        </w:tc>
+      </w:tr>
+      <w:tr>
+        <w:tc>
+          <w:tcPr>
+            <w:tcW w:type="dxa" w:w="1200"/>
+            <w:shd w:fill="F7F7F7" w:color="auto" w:val="clear"/>
+            <w:tcMar>
+              <w:top w:type="dxa" w:w="60"/>
+              <w:left w:type="dxa" w:w="100"/>
+              <w:bottom w:type="dxa" w:w="60"/>
+              <w:right w:type="dxa" w:w="100"/>
+            </w:tcMar>
+            <w:vAlign w:val="top"/>
+          </w:tcPr>
+          <w:p>
+            <w:pPr>
+              <w:spacing w:after="40"/>
+            </w:pPr>
+            <w:r>
+              <w:rPr>
+                <w:b/>
+                <w:bCs/>
+                <w:sz w:val="18"/>
+                <w:szCs w:val="18"/>
+              </w:rPr>
+              <w:t xml:space="preserve">1.1</w:t>
+            </w:r>
+          </w:p>
+        </w:tc>
+        <w:tc>
+          <w:tcPr>
+            <w:tcW w:type="dxa" w:w="2200"/>
+            <w:shd w:fill="F7F7F7" w:color="auto" w:val="clear"/>
+            <w:tcMar>
+              <w:top w:type="dxa" w:w="60"/>
+              <w:left w:type="dxa" w:w="100"/>
+              <w:bottom w:type="dxa" w:w="60"/>
+              <w:right w:type="dxa" w:w="100"/>
+            </w:tcMar>
+            <w:vAlign w:val="top"/>
+          </w:tcPr>
+          <w:p>
+            <w:pPr>
+              <w:spacing w:after="40"/>
+            </w:pPr>
+            <w:r>
+              <w:rPr>
+                <w:b w:val="false"/>
+                <w:bCs w:val="false"/>
+                <w:sz w:val="18"/>
+                <w:szCs w:val="18"/>
+              </w:rPr>
+              <w:t xml:space="preserve">September 22, 2026</w:t>
+            </w:r>
+          </w:p>
+        </w:tc>
+        <w:tc>
+          <w:tcPr>
+            <w:tcW w:type="dxa" w:w="4200"/>
+            <w:shd w:fill="F7F7F7" w:color="auto" w:val="clear"/>
+            <w:tcMar>
+              <w:top w:type="dxa" w:w="60"/>
+              <w:left w:type="dxa" w:w="100"/>
+              <w:bottom w:type="dxa" w:w="60"/>
+              <w:right w:type="dxa" w:w="100"/>
+            </w:tcMar>
+            <w:vAlign w:val="top"/>
+          </w:tcPr>
+          <w:p>
+            <w:pPr>
+              <w:spacing w:after="40"/>
+            </w:pPr>
+            <w:r>
+              <w:rPr>
+                <w:b w:val="false"/>
+                <w:bCs w:val="false"/>
+                <w:sz w:val="18"/>
+                <w:szCs w:val="18"/>
+              </w:rPr>
+              <w:t xml:space="preserve">AWS Business Associate Addendum accepted; remediation item closed</w:t>
+            </w:r>
+          </w:p>
+        </w:tc>
+        <w:tc>
+          <w:tcPr>
+            <w:tcW w:type="dxa" w:w="1760"/>
+            <w:shd w:fill="F7F7F7" w:color="auto" w:val="clear"/>
             <w:tcMar>
               <w:top w:type="dxa" w:w="60"/>
               <w:left w:type="dxa" w:w="100"/>

</xml_diff>